<commit_message>
Update plan of action for project
</commit_message>
<xml_diff>
--- a/docs/PLAN.docx
+++ b/docs/PLAN.docx
@@ -3361,6 +3361,1164 @@
           <w14:ligatures w14:val="none"/>
         </w:rPr>
       </w:pPr>
+    </w:p>
+    <w:p/>
+    <w:p>
+      <w:pPr>
+        <w:shd w:val="clear" w:color="auto" w:fill="282A36"/>
+        <w:spacing w:after="0" w:line="270" w:lineRule="atLeast"/>
+        <w:rPr>
+          <w:rFonts w:ascii="Menlo" w:eastAsia="Times New Roman" w:hAnsi="Menlo" w:cs="Menlo"/>
+          <w:color w:val="F8F8F2"/>
+          <w:kern w:val="0"/>
+          <w:sz w:val="18"/>
+          <w:szCs w:val="18"/>
+          <w14:ligatures w14:val="none"/>
+        </w:rPr>
+      </w:pPr>
+      <w:r>
+        <w:rPr>
+          <w:rFonts w:ascii="Menlo" w:eastAsia="Times New Roman" w:hAnsi="Menlo" w:cs="Menlo"/>
+          <w:b/>
+          <w:bCs/>
+          <w:color w:val="BD93F9"/>
+          <w:kern w:val="0"/>
+          <w:sz w:val="18"/>
+          <w:szCs w:val="18"/>
+          <w14:ligatures w14:val="none"/>
+        </w:rPr>
+        <w:t>### Learning Resources for the Deferred Sections</w:t>
+      </w:r>
+    </w:p>
+    <w:p>
+      <w:pPr>
+        <w:shd w:val="clear" w:color="auto" w:fill="282A36"/>
+        <w:spacing w:after="0" w:line="270" w:lineRule="atLeast"/>
+        <w:rPr>
+          <w:rFonts w:ascii="Menlo" w:eastAsia="Times New Roman" w:hAnsi="Menlo" w:cs="Menlo"/>
+          <w:color w:val="F8F8F2"/>
+          <w:kern w:val="0"/>
+          <w:sz w:val="18"/>
+          <w:szCs w:val="18"/>
+          <w14:ligatures w14:val="none"/>
+        </w:rPr>
+      </w:pPr>
+    </w:p>
+    <w:p>
+      <w:pPr>
+        <w:shd w:val="clear" w:color="auto" w:fill="282A36"/>
+        <w:spacing w:after="0" w:line="270" w:lineRule="atLeast"/>
+        <w:rPr>
+          <w:rFonts w:ascii="Menlo" w:eastAsia="Times New Roman" w:hAnsi="Menlo" w:cs="Menlo"/>
+          <w:color w:val="F8F8F2"/>
+          <w:kern w:val="0"/>
+          <w:sz w:val="18"/>
+          <w:szCs w:val="18"/>
+          <w14:ligatures w14:val="none"/>
+        </w:rPr>
+      </w:pPr>
+      <w:r>
+        <w:rPr>
+          <w:rFonts w:ascii="Menlo" w:eastAsia="Times New Roman" w:hAnsi="Menlo" w:cs="Menlo"/>
+          <w:b/>
+          <w:bCs/>
+          <w:color w:val="FFB86C"/>
+          <w:kern w:val="0"/>
+          <w:sz w:val="18"/>
+          <w:szCs w:val="18"/>
+          <w14:ligatures w14:val="none"/>
+        </w:rPr>
+        <w:t>**For "Tech Stack (Semantic HTML &amp; Accessible Forms)</w:t>
+      </w:r>
+      <w:proofErr w:type="gramStart"/>
+      <w:r>
+        <w:rPr>
+          <w:rFonts w:ascii="Menlo" w:eastAsia="Times New Roman" w:hAnsi="Menlo" w:cs="Menlo"/>
+          <w:b/>
+          <w:bCs/>
+          <w:color w:val="FFB86C"/>
+          <w:kern w:val="0"/>
+          <w:sz w:val="18"/>
+          <w:szCs w:val="18"/>
+          <w14:ligatures w14:val="none"/>
+        </w:rPr>
+        <w:t>":*</w:t>
+      </w:r>
+      <w:proofErr w:type="gramEnd"/>
+      <w:r>
+        <w:rPr>
+          <w:rFonts w:ascii="Menlo" w:eastAsia="Times New Roman" w:hAnsi="Menlo" w:cs="Menlo"/>
+          <w:b/>
+          <w:bCs/>
+          <w:color w:val="FFB86C"/>
+          <w:kern w:val="0"/>
+          <w:sz w:val="18"/>
+          <w:szCs w:val="18"/>
+          <w14:ligatures w14:val="none"/>
+        </w:rPr>
+        <w:t>*</w:t>
+      </w:r>
+    </w:p>
+    <w:p>
+      <w:pPr>
+        <w:shd w:val="clear" w:color="auto" w:fill="282A36"/>
+        <w:spacing w:after="0" w:line="270" w:lineRule="atLeast"/>
+        <w:rPr>
+          <w:rFonts w:ascii="Menlo" w:eastAsia="Times New Roman" w:hAnsi="Menlo" w:cs="Menlo"/>
+          <w:color w:val="F8F8F2"/>
+          <w:kern w:val="0"/>
+          <w:sz w:val="18"/>
+          <w:szCs w:val="18"/>
+          <w14:ligatures w14:val="none"/>
+        </w:rPr>
+      </w:pPr>
+      <w:r>
+        <w:rPr>
+          <w:rFonts w:ascii="Menlo" w:eastAsia="Times New Roman" w:hAnsi="Menlo" w:cs="Menlo"/>
+          <w:color w:val="F8F8F2"/>
+          <w:kern w:val="0"/>
+          <w:sz w:val="18"/>
+          <w:szCs w:val="18"/>
+          <w14:ligatures w14:val="none"/>
+        </w:rPr>
+        <w:t>* [</w:t>
+      </w:r>
+      <w:r>
+        <w:rPr>
+          <w:rFonts w:ascii="Menlo" w:eastAsia="Times New Roman" w:hAnsi="Menlo" w:cs="Menlo"/>
+          <w:color w:val="FF79C6"/>
+          <w:kern w:val="0"/>
+          <w:sz w:val="18"/>
+          <w:szCs w:val="18"/>
+          <w14:ligatures w14:val="none"/>
+        </w:rPr>
+        <w:t xml:space="preserve">MDN Web Docs: HTML forms </w:t>
+      </w:r>
+      <w:proofErr w:type="gramStart"/>
+      <w:r>
+        <w:rPr>
+          <w:rFonts w:ascii="Menlo" w:eastAsia="Times New Roman" w:hAnsi="Menlo" w:cs="Menlo"/>
+          <w:color w:val="FF79C6"/>
+          <w:kern w:val="0"/>
+          <w:sz w:val="18"/>
+          <w:szCs w:val="18"/>
+          <w14:ligatures w14:val="none"/>
+        </w:rPr>
+        <w:t>guide</w:t>
+      </w:r>
+      <w:r>
+        <w:rPr>
+          <w:rFonts w:ascii="Menlo" w:eastAsia="Times New Roman" w:hAnsi="Menlo" w:cs="Menlo"/>
+          <w:color w:val="F8F8F2"/>
+          <w:kern w:val="0"/>
+          <w:sz w:val="18"/>
+          <w:szCs w:val="18"/>
+          <w14:ligatures w14:val="none"/>
+        </w:rPr>
+        <w:t>](</w:t>
+      </w:r>
+      <w:proofErr w:type="gramEnd"/>
+      <w:r>
+        <w:rPr>
+          <w:rFonts w:ascii="Menlo" w:eastAsia="Times New Roman" w:hAnsi="Menlo" w:cs="Menlo"/>
+          <w:color w:val="8BE9FD"/>
+          <w:kern w:val="0"/>
+          <w:sz w:val="18"/>
+          <w:szCs w:val="18"/>
+          <w:u w:val="single"/>
+          <w14:ligatures w14:val="none"/>
+        </w:rPr>
+        <w:t>https://developer.mozilla.org/en-US/docs/Learn/Forms</w:t>
+      </w:r>
+      <w:r>
+        <w:rPr>
+          <w:rFonts w:ascii="Menlo" w:eastAsia="Times New Roman" w:hAnsi="Menlo" w:cs="Menlo"/>
+          <w:color w:val="F8F8F2"/>
+          <w:kern w:val="0"/>
+          <w:sz w:val="18"/>
+          <w:szCs w:val="18"/>
+          <w14:ligatures w14:val="none"/>
+        </w:rPr>
+        <w:t>) – Learn how to structure inputs, labels, and validation properly.</w:t>
+      </w:r>
+    </w:p>
+    <w:p>
+      <w:pPr>
+        <w:shd w:val="clear" w:color="auto" w:fill="282A36"/>
+        <w:spacing w:after="0" w:line="270" w:lineRule="atLeast"/>
+        <w:rPr>
+          <w:rFonts w:ascii="Menlo" w:eastAsia="Times New Roman" w:hAnsi="Menlo" w:cs="Menlo"/>
+          <w:color w:val="F8F8F2"/>
+          <w:kern w:val="0"/>
+          <w:sz w:val="18"/>
+          <w:szCs w:val="18"/>
+          <w14:ligatures w14:val="none"/>
+        </w:rPr>
+      </w:pPr>
+      <w:r>
+        <w:rPr>
+          <w:rFonts w:ascii="Menlo" w:eastAsia="Times New Roman" w:hAnsi="Menlo" w:cs="Menlo"/>
+          <w:color w:val="F8F8F2"/>
+          <w:kern w:val="0"/>
+          <w:sz w:val="18"/>
+          <w:szCs w:val="18"/>
+          <w14:ligatures w14:val="none"/>
+        </w:rPr>
+        <w:t>* [</w:t>
+      </w:r>
+      <w:r>
+        <w:rPr>
+          <w:rFonts w:ascii="Menlo" w:eastAsia="Times New Roman" w:hAnsi="Menlo" w:cs="Menlo"/>
+          <w:color w:val="FF79C6"/>
+          <w:kern w:val="0"/>
+          <w:sz w:val="18"/>
+          <w:szCs w:val="18"/>
+          <w14:ligatures w14:val="none"/>
+        </w:rPr>
+        <w:t>MDN Web Docs: CSS custom properties (variables</w:t>
+      </w:r>
+      <w:proofErr w:type="gramStart"/>
+      <w:r>
+        <w:rPr>
+          <w:rFonts w:ascii="Menlo" w:eastAsia="Times New Roman" w:hAnsi="Menlo" w:cs="Menlo"/>
+          <w:color w:val="FF79C6"/>
+          <w:kern w:val="0"/>
+          <w:sz w:val="18"/>
+          <w:szCs w:val="18"/>
+          <w14:ligatures w14:val="none"/>
+        </w:rPr>
+        <w:t>)</w:t>
+      </w:r>
+      <w:r>
+        <w:rPr>
+          <w:rFonts w:ascii="Menlo" w:eastAsia="Times New Roman" w:hAnsi="Menlo" w:cs="Menlo"/>
+          <w:color w:val="F8F8F2"/>
+          <w:kern w:val="0"/>
+          <w:sz w:val="18"/>
+          <w:szCs w:val="18"/>
+          <w14:ligatures w14:val="none"/>
+        </w:rPr>
+        <w:t>](</w:t>
+      </w:r>
+      <w:proofErr w:type="gramEnd"/>
+      <w:r>
+        <w:rPr>
+          <w:rFonts w:ascii="Menlo" w:eastAsia="Times New Roman" w:hAnsi="Menlo" w:cs="Menlo"/>
+          <w:color w:val="8BE9FD"/>
+          <w:kern w:val="0"/>
+          <w:sz w:val="18"/>
+          <w:szCs w:val="18"/>
+          <w:u w:val="single"/>
+          <w14:ligatures w14:val="none"/>
+        </w:rPr>
+        <w:t>https://developer.mozilla.org/en-US/docs/Web/CSS/Using_CSS_custom_properties</w:t>
+      </w:r>
+      <w:r>
+        <w:rPr>
+          <w:rFonts w:ascii="Menlo" w:eastAsia="Times New Roman" w:hAnsi="Menlo" w:cs="Menlo"/>
+          <w:color w:val="F8F8F2"/>
+          <w:kern w:val="0"/>
+          <w:sz w:val="18"/>
+          <w:szCs w:val="18"/>
+          <w14:ligatures w14:val="none"/>
+        </w:rPr>
+        <w:t>) – Learn how to set up clean theme colors (like your dark warehouse gym colors).</w:t>
+      </w:r>
+    </w:p>
+    <w:p>
+      <w:pPr>
+        <w:shd w:val="clear" w:color="auto" w:fill="282A36"/>
+        <w:spacing w:after="0" w:line="270" w:lineRule="atLeast"/>
+        <w:rPr>
+          <w:rFonts w:ascii="Menlo" w:eastAsia="Times New Roman" w:hAnsi="Menlo" w:cs="Menlo"/>
+          <w:color w:val="F8F8F2"/>
+          <w:kern w:val="0"/>
+          <w:sz w:val="18"/>
+          <w:szCs w:val="18"/>
+          <w14:ligatures w14:val="none"/>
+        </w:rPr>
+      </w:pPr>
+    </w:p>
+    <w:p>
+      <w:pPr>
+        <w:shd w:val="clear" w:color="auto" w:fill="282A36"/>
+        <w:spacing w:after="0" w:line="270" w:lineRule="atLeast"/>
+        <w:rPr>
+          <w:rFonts w:ascii="Menlo" w:eastAsia="Times New Roman" w:hAnsi="Menlo" w:cs="Menlo"/>
+          <w:color w:val="F8F8F2"/>
+          <w:kern w:val="0"/>
+          <w:sz w:val="18"/>
+          <w:szCs w:val="18"/>
+          <w14:ligatures w14:val="none"/>
+        </w:rPr>
+      </w:pPr>
+      <w:r>
+        <w:rPr>
+          <w:rFonts w:ascii="Menlo" w:eastAsia="Times New Roman" w:hAnsi="Menlo" w:cs="Menlo"/>
+          <w:b/>
+          <w:bCs/>
+          <w:color w:val="FFB86C"/>
+          <w:kern w:val="0"/>
+          <w:sz w:val="18"/>
+          <w:szCs w:val="18"/>
+          <w14:ligatures w14:val="none"/>
+        </w:rPr>
+        <w:t>**For "How the Adaptive Engine Handles State" (Phase 3 &amp; 4</w:t>
+      </w:r>
+      <w:proofErr w:type="gramStart"/>
+      <w:r>
+        <w:rPr>
+          <w:rFonts w:ascii="Menlo" w:eastAsia="Times New Roman" w:hAnsi="Menlo" w:cs="Menlo"/>
+          <w:b/>
+          <w:bCs/>
+          <w:color w:val="FFB86C"/>
+          <w:kern w:val="0"/>
+          <w:sz w:val="18"/>
+          <w:szCs w:val="18"/>
+          <w14:ligatures w14:val="none"/>
+        </w:rPr>
+        <w:t>):*</w:t>
+      </w:r>
+      <w:proofErr w:type="gramEnd"/>
+      <w:r>
+        <w:rPr>
+          <w:rFonts w:ascii="Menlo" w:eastAsia="Times New Roman" w:hAnsi="Menlo" w:cs="Menlo"/>
+          <w:b/>
+          <w:bCs/>
+          <w:color w:val="FFB86C"/>
+          <w:kern w:val="0"/>
+          <w:sz w:val="18"/>
+          <w:szCs w:val="18"/>
+          <w14:ligatures w14:val="none"/>
+        </w:rPr>
+        <w:t>*</w:t>
+      </w:r>
+    </w:p>
+    <w:p>
+      <w:pPr>
+        <w:shd w:val="clear" w:color="auto" w:fill="282A36"/>
+        <w:spacing w:after="0" w:line="270" w:lineRule="atLeast"/>
+        <w:rPr>
+          <w:rFonts w:ascii="Menlo" w:eastAsia="Times New Roman" w:hAnsi="Menlo" w:cs="Menlo"/>
+          <w:color w:val="F8F8F2"/>
+          <w:kern w:val="0"/>
+          <w:sz w:val="18"/>
+          <w:szCs w:val="18"/>
+          <w14:ligatures w14:val="none"/>
+        </w:rPr>
+      </w:pPr>
+      <w:r>
+        <w:rPr>
+          <w:rFonts w:ascii="Menlo" w:eastAsia="Times New Roman" w:hAnsi="Menlo" w:cs="Menlo"/>
+          <w:color w:val="F8F8F2"/>
+          <w:kern w:val="0"/>
+          <w:sz w:val="18"/>
+          <w:szCs w:val="18"/>
+          <w14:ligatures w14:val="none"/>
+        </w:rPr>
+        <w:t>* [</w:t>
+      </w:r>
+      <w:r>
+        <w:rPr>
+          <w:rFonts w:ascii="Menlo" w:eastAsia="Times New Roman" w:hAnsi="Menlo" w:cs="Menlo"/>
+          <w:color w:val="FF79C6"/>
+          <w:kern w:val="0"/>
+          <w:sz w:val="18"/>
+          <w:szCs w:val="18"/>
+          <w14:ligatures w14:val="none"/>
+        </w:rPr>
+        <w:t xml:space="preserve">MDN Web Docs: </w:t>
+      </w:r>
+      <w:proofErr w:type="gramStart"/>
+      <w:r>
+        <w:rPr>
+          <w:rFonts w:ascii="Menlo" w:eastAsia="Times New Roman" w:hAnsi="Menlo" w:cs="Menlo"/>
+          <w:color w:val="FF79C6"/>
+          <w:kern w:val="0"/>
+          <w:sz w:val="18"/>
+          <w:szCs w:val="18"/>
+          <w14:ligatures w14:val="none"/>
+        </w:rPr>
+        <w:t>Window.localStorage</w:t>
+      </w:r>
+      <w:r>
+        <w:rPr>
+          <w:rFonts w:ascii="Menlo" w:eastAsia="Times New Roman" w:hAnsi="Menlo" w:cs="Menlo"/>
+          <w:color w:val="F8F8F2"/>
+          <w:kern w:val="0"/>
+          <w:sz w:val="18"/>
+          <w:szCs w:val="18"/>
+          <w14:ligatures w14:val="none"/>
+        </w:rPr>
+        <w:t>](</w:t>
+      </w:r>
+      <w:proofErr w:type="gramEnd"/>
+      <w:r>
+        <w:rPr>
+          <w:rFonts w:ascii="Menlo" w:eastAsia="Times New Roman" w:hAnsi="Menlo" w:cs="Menlo"/>
+          <w:color w:val="8BE9FD"/>
+          <w:kern w:val="0"/>
+          <w:sz w:val="18"/>
+          <w:szCs w:val="18"/>
+          <w:u w:val="single"/>
+          <w14:ligatures w14:val="none"/>
+        </w:rPr>
+        <w:t>https://developer.mozilla.org/en-US/docs/Web/API/Window/localStorage</w:t>
+      </w:r>
+      <w:r>
+        <w:rPr>
+          <w:rFonts w:ascii="Menlo" w:eastAsia="Times New Roman" w:hAnsi="Menlo" w:cs="Menlo"/>
+          <w:color w:val="F8F8F2"/>
+          <w:kern w:val="0"/>
+          <w:sz w:val="18"/>
+          <w:szCs w:val="18"/>
+          <w14:ligatures w14:val="none"/>
+        </w:rPr>
+        <w:t>) – Learn how to save data across browser refreshes.</w:t>
+      </w:r>
+    </w:p>
+    <w:p>
+      <w:pPr>
+        <w:shd w:val="clear" w:color="auto" w:fill="282A36"/>
+        <w:spacing w:after="0" w:line="270" w:lineRule="atLeast"/>
+        <w:rPr>
+          <w:rFonts w:ascii="Menlo" w:eastAsia="Times New Roman" w:hAnsi="Menlo" w:cs="Menlo"/>
+          <w:color w:val="F8F8F2"/>
+          <w:kern w:val="0"/>
+          <w:sz w:val="18"/>
+          <w:szCs w:val="18"/>
+          <w14:ligatures w14:val="none"/>
+        </w:rPr>
+      </w:pPr>
+      <w:r>
+        <w:rPr>
+          <w:rFonts w:ascii="Menlo" w:eastAsia="Times New Roman" w:hAnsi="Menlo" w:cs="Menlo"/>
+          <w:color w:val="F8F8F2"/>
+          <w:kern w:val="0"/>
+          <w:sz w:val="18"/>
+          <w:szCs w:val="18"/>
+          <w14:ligatures w14:val="none"/>
+        </w:rPr>
+        <w:t>* [</w:t>
+      </w:r>
+      <w:r>
+        <w:rPr>
+          <w:rFonts w:ascii="Menlo" w:eastAsia="Times New Roman" w:hAnsi="Menlo" w:cs="Menlo"/>
+          <w:color w:val="FF79C6"/>
+          <w:kern w:val="0"/>
+          <w:sz w:val="18"/>
+          <w:szCs w:val="18"/>
+          <w14:ligatures w14:val="none"/>
+        </w:rPr>
+        <w:t xml:space="preserve">MDN Web Docs: JavaScript Array </w:t>
+      </w:r>
+      <w:proofErr w:type="gramStart"/>
+      <w:r>
+        <w:rPr>
+          <w:rFonts w:ascii="Menlo" w:eastAsia="Times New Roman" w:hAnsi="Menlo" w:cs="Menlo"/>
+          <w:color w:val="FF79C6"/>
+          <w:kern w:val="0"/>
+          <w:sz w:val="18"/>
+          <w:szCs w:val="18"/>
+          <w14:ligatures w14:val="none"/>
+        </w:rPr>
+        <w:t>Reference</w:t>
+      </w:r>
+      <w:r>
+        <w:rPr>
+          <w:rFonts w:ascii="Menlo" w:eastAsia="Times New Roman" w:hAnsi="Menlo" w:cs="Menlo"/>
+          <w:color w:val="F8F8F2"/>
+          <w:kern w:val="0"/>
+          <w:sz w:val="18"/>
+          <w:szCs w:val="18"/>
+          <w14:ligatures w14:val="none"/>
+        </w:rPr>
+        <w:t>](</w:t>
+      </w:r>
+      <w:proofErr w:type="gramEnd"/>
+      <w:r>
+        <w:rPr>
+          <w:rFonts w:ascii="Menlo" w:eastAsia="Times New Roman" w:hAnsi="Menlo" w:cs="Menlo"/>
+          <w:color w:val="8BE9FD"/>
+          <w:kern w:val="0"/>
+          <w:sz w:val="18"/>
+          <w:szCs w:val="18"/>
+          <w:u w:val="single"/>
+          <w14:ligatures w14:val="none"/>
+        </w:rPr>
+        <w:t>https://developer.mozilla.org/en-US/docs/Web/JavaScript/Reference/Global_Objects/Array</w:t>
+      </w:r>
+      <w:r>
+        <w:rPr>
+          <w:rFonts w:ascii="Menlo" w:eastAsia="Times New Roman" w:hAnsi="Menlo" w:cs="Menlo"/>
+          <w:color w:val="F8F8F2"/>
+          <w:kern w:val="0"/>
+          <w:sz w:val="18"/>
+          <w:szCs w:val="18"/>
+          <w14:ligatures w14:val="none"/>
+        </w:rPr>
+        <w:t xml:space="preserve">) – Focus on methods like </w:t>
+      </w:r>
+      <w:proofErr w:type="gramStart"/>
+      <w:r>
+        <w:rPr>
+          <w:rFonts w:ascii="Menlo" w:eastAsia="Times New Roman" w:hAnsi="Menlo" w:cs="Menlo"/>
+          <w:color w:val="50FA7B"/>
+          <w:kern w:val="0"/>
+          <w:sz w:val="18"/>
+          <w:szCs w:val="18"/>
+          <w14:ligatures w14:val="none"/>
+        </w:rPr>
+        <w:t>`.filter()`</w:t>
+      </w:r>
+      <w:proofErr w:type="gramEnd"/>
+      <w:r>
+        <w:rPr>
+          <w:rFonts w:ascii="Menlo" w:eastAsia="Times New Roman" w:hAnsi="Menlo" w:cs="Menlo"/>
+          <w:color w:val="F8F8F2"/>
+          <w:kern w:val="0"/>
+          <w:sz w:val="18"/>
+          <w:szCs w:val="18"/>
+          <w14:ligatures w14:val="none"/>
+        </w:rPr>
+        <w:t xml:space="preserve">, </w:t>
+      </w:r>
+      <w:proofErr w:type="gramStart"/>
+      <w:r>
+        <w:rPr>
+          <w:rFonts w:ascii="Menlo" w:eastAsia="Times New Roman" w:hAnsi="Menlo" w:cs="Menlo"/>
+          <w:color w:val="50FA7B"/>
+          <w:kern w:val="0"/>
+          <w:sz w:val="18"/>
+          <w:szCs w:val="18"/>
+          <w14:ligatures w14:val="none"/>
+        </w:rPr>
+        <w:t>`.map()`</w:t>
+      </w:r>
+      <w:proofErr w:type="gramEnd"/>
+      <w:r>
+        <w:rPr>
+          <w:rFonts w:ascii="Menlo" w:eastAsia="Times New Roman" w:hAnsi="Menlo" w:cs="Menlo"/>
+          <w:color w:val="F8F8F2"/>
+          <w:kern w:val="0"/>
+          <w:sz w:val="18"/>
+          <w:szCs w:val="18"/>
+          <w14:ligatures w14:val="none"/>
+        </w:rPr>
+        <w:t xml:space="preserve">, and </w:t>
+      </w:r>
+      <w:proofErr w:type="gramStart"/>
+      <w:r>
+        <w:rPr>
+          <w:rFonts w:ascii="Menlo" w:eastAsia="Times New Roman" w:hAnsi="Menlo" w:cs="Menlo"/>
+          <w:color w:val="50FA7B"/>
+          <w:kern w:val="0"/>
+          <w:sz w:val="18"/>
+          <w:szCs w:val="18"/>
+          <w14:ligatures w14:val="none"/>
+        </w:rPr>
+        <w:t>`.splice()`</w:t>
+      </w:r>
+      <w:proofErr w:type="gramEnd"/>
+      <w:r>
+        <w:rPr>
+          <w:rFonts w:ascii="Menlo" w:eastAsia="Times New Roman" w:hAnsi="Menlo" w:cs="Menlo"/>
+          <w:color w:val="F8F8F2"/>
+          <w:kern w:val="0"/>
+          <w:sz w:val="18"/>
+          <w:szCs w:val="18"/>
+          <w14:ligatures w14:val="none"/>
+        </w:rPr>
+        <w:t xml:space="preserve"> for shifting and rescheduling exercises.</w:t>
+      </w:r>
+    </w:p>
+    <w:p>
+      <w:pPr>
+        <w:shd w:val="clear" w:color="auto" w:fill="282A36"/>
+        <w:spacing w:after="0" w:line="270" w:lineRule="atLeast"/>
+        <w:rPr>
+          <w:rFonts w:ascii="Menlo" w:eastAsia="Times New Roman" w:hAnsi="Menlo" w:cs="Menlo"/>
+          <w:color w:val="F8F8F2"/>
+          <w:kern w:val="0"/>
+          <w:sz w:val="18"/>
+          <w:szCs w:val="18"/>
+          <w14:ligatures w14:val="none"/>
+        </w:rPr>
+      </w:pPr>
+      <w:r>
+        <w:rPr>
+          <w:rFonts w:ascii="Menlo" w:eastAsia="Times New Roman" w:hAnsi="Menlo" w:cs="Menlo"/>
+          <w:color w:val="F8F8F2"/>
+          <w:kern w:val="0"/>
+          <w:sz w:val="18"/>
+          <w:szCs w:val="18"/>
+          <w14:ligatures w14:val="none"/>
+        </w:rPr>
+        <w:t>* [</w:t>
+      </w:r>
+      <w:r>
+        <w:rPr>
+          <w:rFonts w:ascii="Menlo" w:eastAsia="Times New Roman" w:hAnsi="Menlo" w:cs="Menlo"/>
+          <w:color w:val="FF79C6"/>
+          <w:kern w:val="0"/>
+          <w:sz w:val="18"/>
+          <w:szCs w:val="18"/>
+          <w14:ligatures w14:val="none"/>
+        </w:rPr>
+        <w:t xml:space="preserve">JavaScript.info: Objects and </w:t>
+      </w:r>
+      <w:proofErr w:type="gramStart"/>
+      <w:r>
+        <w:rPr>
+          <w:rFonts w:ascii="Menlo" w:eastAsia="Times New Roman" w:hAnsi="Menlo" w:cs="Menlo"/>
+          <w:color w:val="FF79C6"/>
+          <w:kern w:val="0"/>
+          <w:sz w:val="18"/>
+          <w:szCs w:val="18"/>
+          <w14:ligatures w14:val="none"/>
+        </w:rPr>
+        <w:t>Arrays</w:t>
+      </w:r>
+      <w:r>
+        <w:rPr>
+          <w:rFonts w:ascii="Menlo" w:eastAsia="Times New Roman" w:hAnsi="Menlo" w:cs="Menlo"/>
+          <w:color w:val="F8F8F2"/>
+          <w:kern w:val="0"/>
+          <w:sz w:val="18"/>
+          <w:szCs w:val="18"/>
+          <w14:ligatures w14:val="none"/>
+        </w:rPr>
+        <w:t>](</w:t>
+      </w:r>
+      <w:proofErr w:type="gramEnd"/>
+      <w:r>
+        <w:rPr>
+          <w:rFonts w:ascii="Menlo" w:eastAsia="Times New Roman" w:hAnsi="Menlo" w:cs="Menlo"/>
+          <w:color w:val="8BE9FD"/>
+          <w:kern w:val="0"/>
+          <w:sz w:val="18"/>
+          <w:szCs w:val="18"/>
+          <w:u w:val="single"/>
+          <w14:ligatures w14:val="none"/>
+        </w:rPr>
+        <w:t>https://javascript.info/object</w:t>
+      </w:r>
+      <w:r>
+        <w:rPr>
+          <w:rFonts w:ascii="Menlo" w:eastAsia="Times New Roman" w:hAnsi="Menlo" w:cs="Menlo"/>
+          <w:color w:val="F8F8F2"/>
+          <w:kern w:val="0"/>
+          <w:sz w:val="18"/>
+          <w:szCs w:val="18"/>
+          <w14:ligatures w14:val="none"/>
+        </w:rPr>
+        <w:t>) – Understand how data structures represent a user's daily workout state.</w:t>
+      </w:r>
+    </w:p>
+    <w:p>
+      <w:pPr>
+        <w:shd w:val="clear" w:color="auto" w:fill="282A36"/>
+        <w:spacing w:after="0" w:line="270" w:lineRule="atLeast"/>
+        <w:rPr>
+          <w:rFonts w:ascii="Menlo" w:eastAsia="Times New Roman" w:hAnsi="Menlo" w:cs="Menlo"/>
+          <w:color w:val="F8F8F2"/>
+          <w:kern w:val="0"/>
+          <w:sz w:val="18"/>
+          <w:szCs w:val="18"/>
+          <w14:ligatures w14:val="none"/>
+        </w:rPr>
+      </w:pPr>
+    </w:p>
+    <w:p>
+      <w:pPr>
+        <w:shd w:val="clear" w:color="auto" w:fill="282A36"/>
+        <w:spacing w:after="0" w:line="270" w:lineRule="atLeast"/>
+        <w:rPr>
+          <w:rFonts w:ascii="Menlo" w:eastAsia="Times New Roman" w:hAnsi="Menlo" w:cs="Menlo"/>
+          <w:color w:val="F8F8F2"/>
+          <w:kern w:val="0"/>
+          <w:sz w:val="18"/>
+          <w:szCs w:val="18"/>
+          <w14:ligatures w14:val="none"/>
+        </w:rPr>
+      </w:pPr>
+      <w:r>
+        <w:rPr>
+          <w:rFonts w:ascii="Menlo" w:eastAsia="Times New Roman" w:hAnsi="Menlo" w:cs="Menlo"/>
+          <w:b/>
+          <w:bCs/>
+          <w:color w:val="FFB86C"/>
+          <w:kern w:val="0"/>
+          <w:sz w:val="18"/>
+          <w:szCs w:val="18"/>
+          <w14:ligatures w14:val="none"/>
+        </w:rPr>
+        <w:t>**For "Security &amp; Privacy Considerations" (Phase 4</w:t>
+      </w:r>
+      <w:proofErr w:type="gramStart"/>
+      <w:r>
+        <w:rPr>
+          <w:rFonts w:ascii="Menlo" w:eastAsia="Times New Roman" w:hAnsi="Menlo" w:cs="Menlo"/>
+          <w:b/>
+          <w:bCs/>
+          <w:color w:val="FFB86C"/>
+          <w:kern w:val="0"/>
+          <w:sz w:val="18"/>
+          <w:szCs w:val="18"/>
+          <w14:ligatures w14:val="none"/>
+        </w:rPr>
+        <w:t>):*</w:t>
+      </w:r>
+      <w:proofErr w:type="gramEnd"/>
+      <w:r>
+        <w:rPr>
+          <w:rFonts w:ascii="Menlo" w:eastAsia="Times New Roman" w:hAnsi="Menlo" w:cs="Menlo"/>
+          <w:b/>
+          <w:bCs/>
+          <w:color w:val="FFB86C"/>
+          <w:kern w:val="0"/>
+          <w:sz w:val="18"/>
+          <w:szCs w:val="18"/>
+          <w14:ligatures w14:val="none"/>
+        </w:rPr>
+        <w:t>*</w:t>
+      </w:r>
+    </w:p>
+    <w:p>
+      <w:pPr>
+        <w:shd w:val="clear" w:color="auto" w:fill="282A36"/>
+        <w:spacing w:after="0" w:line="270" w:lineRule="atLeast"/>
+        <w:rPr>
+          <w:rFonts w:ascii="Menlo" w:eastAsia="Times New Roman" w:hAnsi="Menlo" w:cs="Menlo"/>
+          <w:color w:val="F8F8F2"/>
+          <w:kern w:val="0"/>
+          <w:sz w:val="18"/>
+          <w:szCs w:val="18"/>
+          <w14:ligatures w14:val="none"/>
+        </w:rPr>
+      </w:pPr>
+      <w:r>
+        <w:rPr>
+          <w:rFonts w:ascii="Menlo" w:eastAsia="Times New Roman" w:hAnsi="Menlo" w:cs="Menlo"/>
+          <w:color w:val="F8F8F2"/>
+          <w:kern w:val="0"/>
+          <w:sz w:val="18"/>
+          <w:szCs w:val="18"/>
+          <w14:ligatures w14:val="none"/>
+        </w:rPr>
+        <w:t>* [</w:t>
+      </w:r>
+      <w:r>
+        <w:rPr>
+          <w:rFonts w:ascii="Menlo" w:eastAsia="Times New Roman" w:hAnsi="Menlo" w:cs="Menlo"/>
+          <w:color w:val="FF79C6"/>
+          <w:kern w:val="0"/>
+          <w:sz w:val="18"/>
+          <w:szCs w:val="18"/>
+          <w14:ligatures w14:val="none"/>
+        </w:rPr>
+        <w:t xml:space="preserve">MDN Web Docs: </w:t>
+      </w:r>
+      <w:proofErr w:type="spellStart"/>
+      <w:r>
+        <w:rPr>
+          <w:rFonts w:ascii="Menlo" w:eastAsia="Times New Roman" w:hAnsi="Menlo" w:cs="Menlo"/>
+          <w:color w:val="FF79C6"/>
+          <w:kern w:val="0"/>
+          <w:sz w:val="18"/>
+          <w:szCs w:val="18"/>
+          <w14:ligatures w14:val="none"/>
+        </w:rPr>
+        <w:t>Element.textContent</w:t>
+      </w:r>
+      <w:proofErr w:type="spellEnd"/>
+      <w:r>
+        <w:rPr>
+          <w:rFonts w:ascii="Menlo" w:eastAsia="Times New Roman" w:hAnsi="Menlo" w:cs="Menlo"/>
+          <w:color w:val="FF79C6"/>
+          <w:kern w:val="0"/>
+          <w:sz w:val="18"/>
+          <w:szCs w:val="18"/>
+          <w14:ligatures w14:val="none"/>
+        </w:rPr>
+        <w:t xml:space="preserve"> vs. </w:t>
+      </w:r>
+      <w:proofErr w:type="gramStart"/>
+      <w:r>
+        <w:rPr>
+          <w:rFonts w:ascii="Menlo" w:eastAsia="Times New Roman" w:hAnsi="Menlo" w:cs="Menlo"/>
+          <w:color w:val="FF79C6"/>
+          <w:kern w:val="0"/>
+          <w:sz w:val="18"/>
+          <w:szCs w:val="18"/>
+          <w14:ligatures w14:val="none"/>
+        </w:rPr>
+        <w:t>innerHTML</w:t>
+      </w:r>
+      <w:r>
+        <w:rPr>
+          <w:rFonts w:ascii="Menlo" w:eastAsia="Times New Roman" w:hAnsi="Menlo" w:cs="Menlo"/>
+          <w:color w:val="F8F8F2"/>
+          <w:kern w:val="0"/>
+          <w:sz w:val="18"/>
+          <w:szCs w:val="18"/>
+          <w14:ligatures w14:val="none"/>
+        </w:rPr>
+        <w:t>](</w:t>
+      </w:r>
+      <w:proofErr w:type="gramEnd"/>
+      <w:r>
+        <w:rPr>
+          <w:rFonts w:ascii="Menlo" w:eastAsia="Times New Roman" w:hAnsi="Menlo" w:cs="Menlo"/>
+          <w:color w:val="8BE9FD"/>
+          <w:kern w:val="0"/>
+          <w:sz w:val="18"/>
+          <w:szCs w:val="18"/>
+          <w:u w:val="single"/>
+          <w14:ligatures w14:val="none"/>
+        </w:rPr>
+        <w:t>https://developer.mozilla.org/en-US/docs/Web/API/Node/textContent</w:t>
+      </w:r>
+      <w:r>
+        <w:rPr>
+          <w:rFonts w:ascii="Menlo" w:eastAsia="Times New Roman" w:hAnsi="Menlo" w:cs="Menlo"/>
+          <w:color w:val="F8F8F2"/>
+          <w:kern w:val="0"/>
+          <w:sz w:val="18"/>
+          <w:szCs w:val="18"/>
+          <w14:ligatures w14:val="none"/>
+        </w:rPr>
+        <w:t xml:space="preserve">) – Understand how using </w:t>
+      </w:r>
+      <w:r>
+        <w:rPr>
+          <w:rFonts w:ascii="Menlo" w:eastAsia="Times New Roman" w:hAnsi="Menlo" w:cs="Menlo"/>
+          <w:color w:val="50FA7B"/>
+          <w:kern w:val="0"/>
+          <w:sz w:val="18"/>
+          <w:szCs w:val="18"/>
+          <w14:ligatures w14:val="none"/>
+        </w:rPr>
+        <w:t>`</w:t>
+      </w:r>
+      <w:proofErr w:type="spellStart"/>
+      <w:r>
+        <w:rPr>
+          <w:rFonts w:ascii="Menlo" w:eastAsia="Times New Roman" w:hAnsi="Menlo" w:cs="Menlo"/>
+          <w:color w:val="50FA7B"/>
+          <w:kern w:val="0"/>
+          <w:sz w:val="18"/>
+          <w:szCs w:val="18"/>
+          <w14:ligatures w14:val="none"/>
+        </w:rPr>
+        <w:t>textContent</w:t>
+      </w:r>
+      <w:proofErr w:type="spellEnd"/>
+      <w:r>
+        <w:rPr>
+          <w:rFonts w:ascii="Menlo" w:eastAsia="Times New Roman" w:hAnsi="Menlo" w:cs="Menlo"/>
+          <w:color w:val="50FA7B"/>
+          <w:kern w:val="0"/>
+          <w:sz w:val="18"/>
+          <w:szCs w:val="18"/>
+          <w14:ligatures w14:val="none"/>
+        </w:rPr>
+        <w:t>`</w:t>
+      </w:r>
+      <w:r>
+        <w:rPr>
+          <w:rFonts w:ascii="Menlo" w:eastAsia="Times New Roman" w:hAnsi="Menlo" w:cs="Menlo"/>
+          <w:color w:val="F8F8F2"/>
+          <w:kern w:val="0"/>
+          <w:sz w:val="18"/>
+          <w:szCs w:val="18"/>
+          <w14:ligatures w14:val="none"/>
+        </w:rPr>
+        <w:t xml:space="preserve"> keeps user inputs from executing malicious code (XSS prevention).</w:t>
+      </w:r>
+    </w:p>
+    <w:p>
+      <w:pPr>
+        <w:shd w:val="clear" w:color="auto" w:fill="282A36"/>
+        <w:spacing w:after="0" w:line="270" w:lineRule="atLeast"/>
+        <w:rPr>
+          <w:rFonts w:ascii="Menlo" w:eastAsia="Times New Roman" w:hAnsi="Menlo" w:cs="Menlo"/>
+          <w:color w:val="F8F8F2"/>
+          <w:kern w:val="0"/>
+          <w:sz w:val="18"/>
+          <w:szCs w:val="18"/>
+          <w14:ligatures w14:val="none"/>
+        </w:rPr>
+      </w:pPr>
+      <w:r>
+        <w:rPr>
+          <w:rFonts w:ascii="Menlo" w:eastAsia="Times New Roman" w:hAnsi="Menlo" w:cs="Menlo"/>
+          <w:color w:val="F8F8F2"/>
+          <w:kern w:val="0"/>
+          <w:sz w:val="18"/>
+          <w:szCs w:val="18"/>
+          <w14:ligatures w14:val="none"/>
+        </w:rPr>
+        <w:lastRenderedPageBreak/>
+        <w:t>* [</w:t>
+      </w:r>
+      <w:r>
+        <w:rPr>
+          <w:rFonts w:ascii="Menlo" w:eastAsia="Times New Roman" w:hAnsi="Menlo" w:cs="Menlo"/>
+          <w:color w:val="FF79C6"/>
+          <w:kern w:val="0"/>
+          <w:sz w:val="18"/>
+          <w:szCs w:val="18"/>
+          <w14:ligatures w14:val="none"/>
+        </w:rPr>
+        <w:t xml:space="preserve">GitHub Docs: Ignoring files </w:t>
+      </w:r>
+      <w:proofErr w:type="gramStart"/>
+      <w:r>
+        <w:rPr>
+          <w:rFonts w:ascii="Menlo" w:eastAsia="Times New Roman" w:hAnsi="Menlo" w:cs="Menlo"/>
+          <w:color w:val="FF79C6"/>
+          <w:kern w:val="0"/>
+          <w:sz w:val="18"/>
+          <w:szCs w:val="18"/>
+          <w14:ligatures w14:val="none"/>
+        </w:rPr>
+        <w:t>(.gitignore)</w:t>
+      </w:r>
+      <w:r>
+        <w:rPr>
+          <w:rFonts w:ascii="Menlo" w:eastAsia="Times New Roman" w:hAnsi="Menlo" w:cs="Menlo"/>
+          <w:color w:val="F8F8F2"/>
+          <w:kern w:val="0"/>
+          <w:sz w:val="18"/>
+          <w:szCs w:val="18"/>
+          <w14:ligatures w14:val="none"/>
+        </w:rPr>
+        <w:t>](</w:t>
+      </w:r>
+      <w:proofErr w:type="gramEnd"/>
+      <w:r>
+        <w:rPr>
+          <w:rFonts w:ascii="Menlo" w:eastAsia="Times New Roman" w:hAnsi="Menlo" w:cs="Menlo"/>
+          <w:color w:val="8BE9FD"/>
+          <w:kern w:val="0"/>
+          <w:sz w:val="18"/>
+          <w:szCs w:val="18"/>
+          <w:u w:val="single"/>
+          <w14:ligatures w14:val="none"/>
+        </w:rPr>
+        <w:t>https://docs.github.com/en/get-started/getting-started-with-git/ignoring-files</w:t>
+      </w:r>
+      <w:r>
+        <w:rPr>
+          <w:rFonts w:ascii="Menlo" w:eastAsia="Times New Roman" w:hAnsi="Menlo" w:cs="Menlo"/>
+          <w:color w:val="F8F8F2"/>
+          <w:kern w:val="0"/>
+          <w:sz w:val="18"/>
+          <w:szCs w:val="18"/>
+          <w14:ligatures w14:val="none"/>
+        </w:rPr>
+        <w:t>) – Learn how to prevent secrets and private API keys from ever touching a public repository.</w:t>
+      </w:r>
+    </w:p>
+    <w:p>
+      <w:pPr>
+        <w:shd w:val="clear" w:color="auto" w:fill="282A36"/>
+        <w:spacing w:after="0" w:line="270" w:lineRule="atLeast"/>
+        <w:rPr>
+          <w:rFonts w:ascii="Menlo" w:eastAsia="Times New Roman" w:hAnsi="Menlo" w:cs="Menlo"/>
+          <w:color w:val="F8F8F2"/>
+          <w:kern w:val="0"/>
+          <w:sz w:val="18"/>
+          <w:szCs w:val="18"/>
+          <w14:ligatures w14:val="none"/>
+        </w:rPr>
+      </w:pPr>
+    </w:p>
+    <w:p>
+      <w:pPr>
+        <w:shd w:val="clear" w:color="auto" w:fill="282A36"/>
+        <w:spacing w:after="0" w:line="270" w:lineRule="atLeast"/>
+        <w:rPr>
+          <w:rFonts w:ascii="Menlo" w:eastAsia="Times New Roman" w:hAnsi="Menlo" w:cs="Menlo"/>
+          <w:color w:val="F8F8F2"/>
+          <w:kern w:val="0"/>
+          <w:sz w:val="18"/>
+          <w:szCs w:val="18"/>
+          <w14:ligatures w14:val="none"/>
+        </w:rPr>
+      </w:pPr>
+      <w:r>
+        <w:rPr>
+          <w:rFonts w:ascii="Menlo" w:eastAsia="Times New Roman" w:hAnsi="Menlo" w:cs="Menlo"/>
+          <w:color w:val="F8F8F2"/>
+          <w:kern w:val="0"/>
+          <w:sz w:val="18"/>
+          <w:szCs w:val="18"/>
+          <w14:ligatures w14:val="none"/>
+        </w:rPr>
+        <w:t>&lt;</w:t>
+      </w:r>
+      <w:proofErr w:type="spellStart"/>
+      <w:r>
+        <w:rPr>
+          <w:rFonts w:ascii="Menlo" w:eastAsia="Times New Roman" w:hAnsi="Menlo" w:cs="Menlo"/>
+          <w:color w:val="FF79C6"/>
+          <w:kern w:val="0"/>
+          <w:sz w:val="18"/>
+          <w:szCs w:val="18"/>
+          <w14:ligatures w14:val="none"/>
+        </w:rPr>
+        <w:t>FollowUp</w:t>
+      </w:r>
+      <w:proofErr w:type="spellEnd"/>
+      <w:r>
+        <w:rPr>
+          <w:rFonts w:ascii="Menlo" w:eastAsia="Times New Roman" w:hAnsi="Menlo" w:cs="Menlo"/>
+          <w:color w:val="F8F8F2"/>
+          <w:kern w:val="0"/>
+          <w:sz w:val="18"/>
+          <w:szCs w:val="18"/>
+          <w14:ligatures w14:val="none"/>
+        </w:rPr>
+        <w:t xml:space="preserve"> </w:t>
+      </w:r>
+      <w:r>
+        <w:rPr>
+          <w:rFonts w:ascii="Menlo" w:eastAsia="Times New Roman" w:hAnsi="Menlo" w:cs="Menlo"/>
+          <w:i/>
+          <w:iCs/>
+          <w:color w:val="50FA7B"/>
+          <w:kern w:val="0"/>
+          <w:sz w:val="18"/>
+          <w:szCs w:val="18"/>
+          <w14:ligatures w14:val="none"/>
+        </w:rPr>
+        <w:t>label</w:t>
+      </w:r>
+      <w:r>
+        <w:rPr>
+          <w:rFonts w:ascii="Menlo" w:eastAsia="Times New Roman" w:hAnsi="Menlo" w:cs="Menlo"/>
+          <w:color w:val="FF79C6"/>
+          <w:kern w:val="0"/>
+          <w:sz w:val="18"/>
+          <w:szCs w:val="18"/>
+          <w14:ligatures w14:val="none"/>
+        </w:rPr>
+        <w:t>=</w:t>
+      </w:r>
+      <w:r>
+        <w:rPr>
+          <w:rFonts w:ascii="Menlo" w:eastAsia="Times New Roman" w:hAnsi="Menlo" w:cs="Menlo"/>
+          <w:color w:val="E9F284"/>
+          <w:kern w:val="0"/>
+          <w:sz w:val="18"/>
+          <w:szCs w:val="18"/>
+          <w14:ligatures w14:val="none"/>
+        </w:rPr>
+        <w:t>"</w:t>
+      </w:r>
+      <w:r>
+        <w:rPr>
+          <w:rFonts w:ascii="Menlo" w:eastAsia="Times New Roman" w:hAnsi="Menlo" w:cs="Menlo"/>
+          <w:color w:val="F1FA8C"/>
+          <w:kern w:val="0"/>
+          <w:sz w:val="18"/>
+          <w:szCs w:val="18"/>
+          <w14:ligatures w14:val="none"/>
+        </w:rPr>
+        <w:t>Want to start setting up your HTML form inputs and labels first?</w:t>
+      </w:r>
+      <w:r>
+        <w:rPr>
+          <w:rFonts w:ascii="Menlo" w:eastAsia="Times New Roman" w:hAnsi="Menlo" w:cs="Menlo"/>
+          <w:color w:val="E9F284"/>
+          <w:kern w:val="0"/>
+          <w:sz w:val="18"/>
+          <w:szCs w:val="18"/>
+          <w14:ligatures w14:val="none"/>
+        </w:rPr>
+        <w:t>"</w:t>
+      </w:r>
+      <w:r>
+        <w:rPr>
+          <w:rFonts w:ascii="Menlo" w:eastAsia="Times New Roman" w:hAnsi="Menlo" w:cs="Menlo"/>
+          <w:color w:val="F8F8F2"/>
+          <w:kern w:val="0"/>
+          <w:sz w:val="18"/>
+          <w:szCs w:val="18"/>
+          <w14:ligatures w14:val="none"/>
+        </w:rPr>
+        <w:t xml:space="preserve"> </w:t>
+      </w:r>
+      <w:r>
+        <w:rPr>
+          <w:rFonts w:ascii="Menlo" w:eastAsia="Times New Roman" w:hAnsi="Menlo" w:cs="Menlo"/>
+          <w:i/>
+          <w:iCs/>
+          <w:color w:val="50FA7B"/>
+          <w:kern w:val="0"/>
+          <w:sz w:val="18"/>
+          <w:szCs w:val="18"/>
+          <w14:ligatures w14:val="none"/>
+        </w:rPr>
+        <w:t>query</w:t>
+      </w:r>
+      <w:r>
+        <w:rPr>
+          <w:rFonts w:ascii="Menlo" w:eastAsia="Times New Roman" w:hAnsi="Menlo" w:cs="Menlo"/>
+          <w:color w:val="FF79C6"/>
+          <w:kern w:val="0"/>
+          <w:sz w:val="18"/>
+          <w:szCs w:val="18"/>
+          <w14:ligatures w14:val="none"/>
+        </w:rPr>
+        <w:t>=</w:t>
+      </w:r>
+      <w:r>
+        <w:rPr>
+          <w:rFonts w:ascii="Menlo" w:eastAsia="Times New Roman" w:hAnsi="Menlo" w:cs="Menlo"/>
+          <w:color w:val="E9F284"/>
+          <w:kern w:val="0"/>
+          <w:sz w:val="18"/>
+          <w:szCs w:val="18"/>
+          <w14:ligatures w14:val="none"/>
+        </w:rPr>
+        <w:t>"</w:t>
+      </w:r>
+      <w:r>
+        <w:rPr>
+          <w:rFonts w:ascii="Menlo" w:eastAsia="Times New Roman" w:hAnsi="Menlo" w:cs="Menlo"/>
+          <w:color w:val="F1FA8C"/>
+          <w:kern w:val="0"/>
+          <w:sz w:val="18"/>
+          <w:szCs w:val="18"/>
+          <w14:ligatures w14:val="none"/>
+        </w:rPr>
+        <w:t>Let's start Phase 1. Give me a hint on how to structure the HTML form inputs and link labels properly for Jimbo.</w:t>
+      </w:r>
+      <w:r>
+        <w:rPr>
+          <w:rFonts w:ascii="Menlo" w:eastAsia="Times New Roman" w:hAnsi="Menlo" w:cs="Menlo"/>
+          <w:color w:val="E9F284"/>
+          <w:kern w:val="0"/>
+          <w:sz w:val="18"/>
+          <w:szCs w:val="18"/>
+          <w14:ligatures w14:val="none"/>
+        </w:rPr>
+        <w:t>"</w:t>
+      </w:r>
+      <w:r>
+        <w:rPr>
+          <w:rFonts w:ascii="Menlo" w:eastAsia="Times New Roman" w:hAnsi="Menlo" w:cs="Menlo"/>
+          <w:color w:val="F8F8F2"/>
+          <w:kern w:val="0"/>
+          <w:sz w:val="18"/>
+          <w:szCs w:val="18"/>
+          <w14:ligatures w14:val="none"/>
+        </w:rPr>
+        <w:t>/&gt;</w:t>
+      </w:r>
     </w:p>
     <w:p/>
     <w:sectPr>

</xml_diff>